<commit_message>
Timbrado GSO: remove e-mail e OAB do rodape (pedido do Gustavo)
Rodape final: endereco QS Tower na linha 1, CEP + telefone na linha 2.

Co-Authored-By: Claude Opus 4.8 (1M context) <noreply@anthropic.com>
</commit_message>
<xml_diff>
--- a/Escritorio/Modelos/timbrado-gso.docx
+++ b/Escritorio/Modelos/timbrado-gso.docx
@@ -316,46 +316,6 @@
         <w:szCs w:val="13"/>
       </w:rPr>
       <w:t xml:space="preserve">(62) 99366-4193</w:t>
-    </w:r>
-    <w:r>
-      <w:rPr>
-        <w:rFonts w:ascii="Segoe UI" w:cs="Segoe UI" w:eastAsia="Segoe UI" w:hAnsi="Segoe UI"/>
-        <w:color w:val="A57B45"/>
-        <w:spacing w:val="24"/>
-        <w:sz w:val="13"/>
-        <w:szCs w:val="13"/>
-      </w:rPr>
-      <w:t xml:space="preserve">   ·   </w:t>
-    </w:r>
-    <w:r>
-      <w:rPr>
-        <w:rFonts w:ascii="Segoe UI" w:cs="Segoe UI" w:eastAsia="Segoe UI" w:hAnsi="Segoe UI"/>
-        <w:color w:val="5A6068"/>
-        <w:spacing w:val="24"/>
-        <w:sz w:val="13"/>
-        <w:szCs w:val="13"/>
-      </w:rPr>
-      <w:t xml:space="preserve">ggsoliveira35@gmail.com</w:t>
-    </w:r>
-    <w:r>
-      <w:rPr>
-        <w:rFonts w:ascii="Segoe UI" w:cs="Segoe UI" w:eastAsia="Segoe UI" w:hAnsi="Segoe UI"/>
-        <w:color w:val="A57B45"/>
-        <w:spacing w:val="24"/>
-        <w:sz w:val="13"/>
-        <w:szCs w:val="13"/>
-      </w:rPr>
-      <w:t xml:space="preserve">   ·   </w:t>
-    </w:r>
-    <w:r>
-      <w:rPr>
-        <w:rFonts w:ascii="Segoe UI" w:cs="Segoe UI" w:eastAsia="Segoe UI" w:hAnsi="Segoe UI"/>
-        <w:color w:val="A57B45"/>
-        <w:spacing w:val="24"/>
-        <w:sz w:val="13"/>
-        <w:szCs w:val="13"/>
-      </w:rPr>
-      <w:t xml:space="preserve">OAB/GO 66.404</w:t>
     </w:r>
   </w:p>
 </w:ftr>

</xml_diff>